<commit_message>
Rename subject to Models of Computation; add presentation script
Co-Authored-By: Claude Opus 5.5 <noreply@anthropic.com>
Claude-Session: https://claude.ai/code/session_01RYXf9bubFjEyMehJqio2bK
</commit_message>
<xml_diff>
--- a/report/MOC_Project_Report_Phishing_URL_Detector.docx
+++ b/report/MOC_Project_Report_Phishing_URL_Detector.docx
@@ -15,7 +15,7 @@
           <w:sz w:val="30"/>
           <w:szCs w:val="30"/>
         </w:rPr>
-        <w:t xml:space="preserve">MODEL OF COMPUTATION</w:t>
+        <w:t xml:space="preserve">MODELS OF COMPUTATION</w:t>
       </w:r>
     </w:p>
     <w:p>
@@ -312,7 +312,7 @@
           <w:sz w:val="24"/>
           <w:szCs w:val="24"/>
         </w:rPr>
-        <w:t xml:space="preserve">Subject: Theory of Computation / Model of Computation (MOC)</w:t>
+        <w:t xml:space="preserve">Subject: Models of Computation (MOC)</w:t>
       </w:r>
     </w:p>
     <w:p>
@@ -379,7 +379,7 @@
         <w:jc w:val="both"/>
       </w:pPr>
       <w:r>
-        <w:t xml:space="preserve">Phishing attacks lure users to fraudulent websites through deceptive URLs, and many of these URLs share recognisable textual patterns. This project investigates how such patterns can be detected with the models of computation studied in Theory of Computation. The objective is an explainable, rule-based phishing URL detector in which every suspicious pattern is a regular language recognised by a finite automaton. A URL is modelled as a string over a 60-symbol alphabet Σ. Thirteen patterns, nine suspicious keywords, the “@” symbol, an IPv4 address used as the hostname, punycode hosts and “//” redirections, are written as regular expressions. Each expression is converted into an NFA with ε-moves, turned into a DFA by the subset construction, and reduced to a minimal DFA by partition refinement. The minimal DFAs read the URL, or its host or path component, one symbol at a time. Their accept or reject verdicts are combined with three structural rules into a weighted risk score, classified as Low Risk, Suspicious or High Risk. The engine was implemented in Python with a Flask API and an interactive web interface. Every minimal DFA agreed with Python's regular-expression engine on all 4.07 million test strings, scanned input in linear time (about 0.38 µs per character), and minimisation roughly halved each keyword automaton. On a 22-URL illustrative set, the detector classified 19 URLs as labelled. The project shows that regular languages and finite automata give a fast, verifiable and transparent basis for pattern-based URL screening, and makes their limits visible.</w:t>
+        <w:t xml:space="preserve">Phishing attacks lure users to fraudulent websites through deceptive URLs, and many of these URLs share recognisable textual patterns. This project investigates how such patterns can be detected with the models studied in the Models of Computation course. The objective is an explainable, rule-based phishing URL detector in which every suspicious pattern is a regular language recognised by a finite automaton. A URL is modelled as a string over a 60-symbol alphabet Σ. Thirteen patterns, nine suspicious keywords, the “@” symbol, an IPv4 address used as the hostname, punycode hosts and “//” redirections, are written as regular expressions. Each expression is converted into an NFA with ε-moves, turned into a DFA by the subset construction, and reduced to a minimal DFA by partition refinement. The minimal DFAs read the URL, or its host or path component, one symbol at a time. Their accept or reject verdicts are combined with three structural rules into a weighted risk score, classified as Low Risk, Suspicious or High Risk. The engine was implemented in Python with a Flask API and an interactive web interface. Every minimal DFA agreed with Python's regular-expression engine on all 4.07 million test strings, scanned input in linear time (about 0.38 µs per character), and minimisation roughly halved each keyword automaton. On a 22-URL illustrative set, the detector classified 19 URLs as labelled. The project shows that regular languages and finite automata give a fast, verifiable and transparent basis for pattern-based URL screening, and makes their limits visible.</w:t>
       </w:r>
     </w:p>
     <w:p>
@@ -395,7 +395,7 @@
         <w:t xml:space="preserve">Keywords: </w:t>
       </w:r>
       <w:r>
-        <w:t xml:space="preserve">Model of Computation, Finite Automata (DFA, NFA), Regular Expressions, Phishing URL Detection, Cybersecurity, Subset Construction, DFA Minimisation, Rule-Based Risk Scoring.</w:t>
+        <w:t xml:space="preserve">Models of Computation, Finite Automata (DFA, NFA), Regular Expressions, Phishing URL Detection, Cybersecurity, Subset Construction, DFA Minimisation, Rule-Based Risk Scoring.</w:t>
       </w:r>
     </w:p>
     <w:p>
@@ -874,7 +874,7 @@
         <w:jc w:val="both"/>
       </w:pPr>
       <w:r>
-        <w:t xml:space="preserve">Production systems detect phishing with blocklists, reputation services and machine-learning classifiers. Those methods are effective but often opaque. They need large labelled datasets, and their decisions are hard to explain. A Theory of Computation course offers another view of the same problem: a URL is a finite string over a finite alphabet, and a “suspicious pattern” is a set of strings, that is, a formal language. When that language is regular, a finite automaton can recognise it exactly, in a single left-to-right pass, with constant memory.</w:t>
+        <w:t xml:space="preserve">Production systems detect phishing with blocklists, reputation services and machine-learning classifiers. Those methods are effective but often opaque. They need large labelled datasets, and their decisions are hard to explain. A Models of Computation course offers another view of the same problem: a URL is a finite string over a finite alphabet, and a “suspicious pattern” is a set of strings, that is, a formal language. When that language is regular, a finite automaton can recognise it exactly, in a single left-to-right pass, with constant memory.</w:t>
       </w:r>
     </w:p>
     <w:p>
@@ -23525,7 +23525,7 @@
         <w:jc w:val="both"/>
       </w:pPr>
       <w:r>
-        <w:t xml:space="preserve">This project applied the models of computation from Theory of Computation to a real cybersecurity problem. URLs were modelled as strings over a 60-symbol alphabet, and thirteen suspicious patterns were specified as regular expressions. Each expression was compiled by the standard constructions, converted into an NFA, determinised by the subset construction and minimised by partition refinement, into a minimal DFA that scans the relevant part of the URL in linear time. The DFA verdicts and three structural rules produce a transparent risk score and class.</w:t>
+        <w:t xml:space="preserve">This project applied the models studied in Models of Computation to a real cybersecurity problem. URLs were modelled as strings over a 60-symbol alphabet, and thirteen suspicious patterns were specified as regular expressions. Each expression was compiled by the standard constructions, converted into an NFA, determinised by the subset construction and minimised by partition refinement, into a minimal DFA that scans the relevant part of the URL in linear time. The DFA verdicts and three structural rules produce a transparent risk score and class.</w:t>
       </w:r>
     </w:p>
     <w:p>

</xml_diff>

<commit_message>
Report: white table headers and code blocks instead of blue shading
Co-Authored-By: Claude Opus 5.5 <noreply@anthropic.com>
Claude-Session: https://claude.ai/code/session_01RYXf9bubFjEyMehJqio2bK
</commit_message>
<xml_diff>
--- a/report/MOC_Project_Report_Phishing_URL_Detector.docx
+++ b/report/MOC_Project_Report_Phishing_URL_Detector.docx
@@ -117,7 +117,7 @@
               <w:bottom w:val="single" w:color="9AA3B5" w:sz="4"/>
               <w:right w:val="single" w:color="9AA3B5" w:sz="4"/>
             </w:tcBorders>
-            <w:shd w:fill="DCE3F3" w:color="auto" w:val="clear"/>
+            <w:shd w:fill="FFFFFF" w:color="auto" w:val="clear"/>
             <w:tcMar>
               <w:top w:type="dxa" w:w="80"/>
               <w:left w:type="dxa" w:w="120"/>
@@ -149,7 +149,7 @@
               <w:bottom w:val="single" w:color="9AA3B5" w:sz="4"/>
               <w:right w:val="single" w:color="9AA3B5" w:sz="4"/>
             </w:tcBorders>
-            <w:shd w:fill="DCE3F3" w:color="auto" w:val="clear"/>
+            <w:shd w:fill="FFFFFF" w:color="auto" w:val="clear"/>
             <w:tcMar>
               <w:top w:type="dxa" w:w="80"/>
               <w:left w:type="dxa" w:w="120"/>
@@ -1499,7 +1499,7 @@
               <w:bottom w:val="single" w:color="9AA3B5" w:sz="4"/>
               <w:right w:val="single" w:color="9AA3B5" w:sz="4"/>
             </w:tcBorders>
-            <w:shd w:fill="DCE3F3" w:color="auto" w:val="clear"/>
+            <w:shd w:fill="FFFFFF" w:color="auto" w:val="clear"/>
             <w:tcMar>
               <w:top w:type="dxa" w:w="50"/>
               <w:left w:type="dxa" w:w="90"/>
@@ -1533,7 +1533,7 @@
               <w:bottom w:val="single" w:color="9AA3B5" w:sz="4"/>
               <w:right w:val="single" w:color="9AA3B5" w:sz="4"/>
             </w:tcBorders>
-            <w:shd w:fill="DCE3F3" w:color="auto" w:val="clear"/>
+            <w:shd w:fill="FFFFFF" w:color="auto" w:val="clear"/>
             <w:tcMar>
               <w:top w:type="dxa" w:w="50"/>
               <w:left w:type="dxa" w:w="90"/>
@@ -1567,7 +1567,7 @@
               <w:bottom w:val="single" w:color="9AA3B5" w:sz="4"/>
               <w:right w:val="single" w:color="9AA3B5" w:sz="4"/>
             </w:tcBorders>
-            <w:shd w:fill="DCE3F3" w:color="auto" w:val="clear"/>
+            <w:shd w:fill="FFFFFF" w:color="auto" w:val="clear"/>
             <w:tcMar>
               <w:top w:type="dxa" w:w="50"/>
               <w:left w:type="dxa" w:w="90"/>
@@ -3152,7 +3152,7 @@
               <w:bottom w:val="single" w:color="9AA3B5" w:sz="4"/>
               <w:right w:val="single" w:color="9AA3B5" w:sz="4"/>
             </w:tcBorders>
-            <w:shd w:fill="DCE3F3" w:color="auto" w:val="clear"/>
+            <w:shd w:fill="FFFFFF" w:color="auto" w:val="clear"/>
             <w:tcMar>
               <w:top w:type="dxa" w:w="50"/>
               <w:left w:type="dxa" w:w="90"/>
@@ -3186,7 +3186,7 @@
               <w:bottom w:val="single" w:color="9AA3B5" w:sz="4"/>
               <w:right w:val="single" w:color="9AA3B5" w:sz="4"/>
             </w:tcBorders>
-            <w:shd w:fill="DCE3F3" w:color="auto" w:val="clear"/>
+            <w:shd w:fill="FFFFFF" w:color="auto" w:val="clear"/>
             <w:tcMar>
               <w:top w:type="dxa" w:w="50"/>
               <w:left w:type="dxa" w:w="90"/>
@@ -3220,7 +3220,7 @@
               <w:bottom w:val="single" w:color="9AA3B5" w:sz="4"/>
               <w:right w:val="single" w:color="9AA3B5" w:sz="4"/>
             </w:tcBorders>
-            <w:shd w:fill="DCE3F3" w:color="auto" w:val="clear"/>
+            <w:shd w:fill="FFFFFF" w:color="auto" w:val="clear"/>
             <w:tcMar>
               <w:top w:type="dxa" w:w="50"/>
               <w:left w:type="dxa" w:w="90"/>
@@ -3254,7 +3254,7 @@
               <w:bottom w:val="single" w:color="9AA3B5" w:sz="4"/>
               <w:right w:val="single" w:color="9AA3B5" w:sz="4"/>
             </w:tcBorders>
-            <w:shd w:fill="DCE3F3" w:color="auto" w:val="clear"/>
+            <w:shd w:fill="FFFFFF" w:color="auto" w:val="clear"/>
             <w:tcMar>
               <w:top w:type="dxa" w:w="50"/>
               <w:left w:type="dxa" w:w="90"/>
@@ -4818,7 +4818,7 @@
               <w:bottom w:val="single" w:color="9AA3B5" w:sz="4"/>
               <w:right w:val="single" w:color="9AA3B5" w:sz="4"/>
             </w:tcBorders>
-            <w:shd w:fill="DCE3F3" w:color="auto" w:val="clear"/>
+            <w:shd w:fill="FFFFFF" w:color="auto" w:val="clear"/>
             <w:tcMar>
               <w:top w:type="dxa" w:w="50"/>
               <w:left w:type="dxa" w:w="90"/>
@@ -4852,7 +4852,7 @@
               <w:bottom w:val="single" w:color="9AA3B5" w:sz="4"/>
               <w:right w:val="single" w:color="9AA3B5" w:sz="4"/>
             </w:tcBorders>
-            <w:shd w:fill="DCE3F3" w:color="auto" w:val="clear"/>
+            <w:shd w:fill="FFFFFF" w:color="auto" w:val="clear"/>
             <w:tcMar>
               <w:top w:type="dxa" w:w="50"/>
               <w:left w:type="dxa" w:w="90"/>
@@ -4886,7 +4886,7 @@
               <w:bottom w:val="single" w:color="9AA3B5" w:sz="4"/>
               <w:right w:val="single" w:color="9AA3B5" w:sz="4"/>
             </w:tcBorders>
-            <w:shd w:fill="DCE3F3" w:color="auto" w:val="clear"/>
+            <w:shd w:fill="FFFFFF" w:color="auto" w:val="clear"/>
             <w:tcMar>
               <w:top w:type="dxa" w:w="50"/>
               <w:left w:type="dxa" w:w="90"/>
@@ -4920,7 +4920,7 @@
               <w:bottom w:val="single" w:color="9AA3B5" w:sz="4"/>
               <w:right w:val="single" w:color="9AA3B5" w:sz="4"/>
             </w:tcBorders>
-            <w:shd w:fill="DCE3F3" w:color="auto" w:val="clear"/>
+            <w:shd w:fill="FFFFFF" w:color="auto" w:val="clear"/>
             <w:tcMar>
               <w:top w:type="dxa" w:w="50"/>
               <w:left w:type="dxa" w:w="90"/>
@@ -4954,7 +4954,7 @@
               <w:bottom w:val="single" w:color="9AA3B5" w:sz="4"/>
               <w:right w:val="single" w:color="9AA3B5" w:sz="4"/>
             </w:tcBorders>
-            <w:shd w:fill="DCE3F3" w:color="auto" w:val="clear"/>
+            <w:shd w:fill="FFFFFF" w:color="auto" w:val="clear"/>
             <w:tcMar>
               <w:top w:type="dxa" w:w="50"/>
               <w:left w:type="dxa" w:w="90"/>
@@ -4988,7 +4988,7 @@
               <w:bottom w:val="single" w:color="9AA3B5" w:sz="4"/>
               <w:right w:val="single" w:color="9AA3B5" w:sz="4"/>
             </w:tcBorders>
-            <w:shd w:fill="DCE3F3" w:color="auto" w:val="clear"/>
+            <w:shd w:fill="FFFFFF" w:color="auto" w:val="clear"/>
             <w:tcMar>
               <w:top w:type="dxa" w:w="50"/>
               <w:left w:type="dxa" w:w="90"/>
@@ -5022,7 +5022,7 @@
               <w:bottom w:val="single" w:color="9AA3B5" w:sz="4"/>
               <w:right w:val="single" w:color="9AA3B5" w:sz="4"/>
             </w:tcBorders>
-            <w:shd w:fill="DCE3F3" w:color="auto" w:val="clear"/>
+            <w:shd w:fill="FFFFFF" w:color="auto" w:val="clear"/>
             <w:tcMar>
               <w:top w:type="dxa" w:w="50"/>
               <w:left w:type="dxa" w:w="90"/>
@@ -5056,7 +5056,7 @@
               <w:bottom w:val="single" w:color="9AA3B5" w:sz="4"/>
               <w:right w:val="single" w:color="9AA3B5" w:sz="4"/>
             </w:tcBorders>
-            <w:shd w:fill="DCE3F3" w:color="auto" w:val="clear"/>
+            <w:shd w:fill="FFFFFF" w:color="auto" w:val="clear"/>
             <w:tcMar>
               <w:top w:type="dxa" w:w="50"/>
               <w:left w:type="dxa" w:w="90"/>
@@ -8703,7 +8703,7 @@
               <w:bottom w:val="single" w:color="9AA3B5" w:sz="4"/>
               <w:right w:val="single" w:color="9AA3B5" w:sz="4"/>
             </w:tcBorders>
-            <w:shd w:fill="DCE3F3" w:color="auto" w:val="clear"/>
+            <w:shd w:fill="FFFFFF" w:color="auto" w:val="clear"/>
             <w:tcMar>
               <w:top w:type="dxa" w:w="50"/>
               <w:left w:type="dxa" w:w="90"/>
@@ -8737,7 +8737,7 @@
               <w:bottom w:val="single" w:color="9AA3B5" w:sz="4"/>
               <w:right w:val="single" w:color="9AA3B5" w:sz="4"/>
             </w:tcBorders>
-            <w:shd w:fill="DCE3F3" w:color="auto" w:val="clear"/>
+            <w:shd w:fill="FFFFFF" w:color="auto" w:val="clear"/>
             <w:tcMar>
               <w:top w:type="dxa" w:w="50"/>
               <w:left w:type="dxa" w:w="90"/>
@@ -8771,7 +8771,7 @@
               <w:bottom w:val="single" w:color="9AA3B5" w:sz="4"/>
               <w:right w:val="single" w:color="9AA3B5" w:sz="4"/>
             </w:tcBorders>
-            <w:shd w:fill="DCE3F3" w:color="auto" w:val="clear"/>
+            <w:shd w:fill="FFFFFF" w:color="auto" w:val="clear"/>
             <w:tcMar>
               <w:top w:type="dxa" w:w="50"/>
               <w:left w:type="dxa" w:w="90"/>
@@ -8805,7 +8805,7 @@
               <w:bottom w:val="single" w:color="9AA3B5" w:sz="4"/>
               <w:right w:val="single" w:color="9AA3B5" w:sz="4"/>
             </w:tcBorders>
-            <w:shd w:fill="DCE3F3" w:color="auto" w:val="clear"/>
+            <w:shd w:fill="FFFFFF" w:color="auto" w:val="clear"/>
             <w:tcMar>
               <w:top w:type="dxa" w:w="50"/>
               <w:left w:type="dxa" w:w="90"/>
@@ -8839,7 +8839,7 @@
               <w:bottom w:val="single" w:color="9AA3B5" w:sz="4"/>
               <w:right w:val="single" w:color="9AA3B5" w:sz="4"/>
             </w:tcBorders>
-            <w:shd w:fill="DCE3F3" w:color="auto" w:val="clear"/>
+            <w:shd w:fill="FFFFFF" w:color="auto" w:val="clear"/>
             <w:tcMar>
               <w:top w:type="dxa" w:w="50"/>
               <w:left w:type="dxa" w:w="90"/>
@@ -8873,7 +8873,7 @@
               <w:bottom w:val="single" w:color="9AA3B5" w:sz="4"/>
               <w:right w:val="single" w:color="9AA3B5" w:sz="4"/>
             </w:tcBorders>
-            <w:shd w:fill="DCE3F3" w:color="auto" w:val="clear"/>
+            <w:shd w:fill="FFFFFF" w:color="auto" w:val="clear"/>
             <w:tcMar>
               <w:top w:type="dxa" w:w="50"/>
               <w:left w:type="dxa" w:w="90"/>
@@ -8907,7 +8907,7 @@
               <w:bottom w:val="single" w:color="9AA3B5" w:sz="4"/>
               <w:right w:val="single" w:color="9AA3B5" w:sz="4"/>
             </w:tcBorders>
-            <w:shd w:fill="DCE3F3" w:color="auto" w:val="clear"/>
+            <w:shd w:fill="FFFFFF" w:color="auto" w:val="clear"/>
             <w:tcMar>
               <w:top w:type="dxa" w:w="50"/>
               <w:left w:type="dxa" w:w="90"/>
@@ -10464,7 +10464,7 @@
               <w:bottom w:val="single" w:color="9AA3B5" w:sz="4"/>
               <w:right w:val="single" w:color="9AA3B5" w:sz="4"/>
             </w:tcBorders>
-            <w:shd w:fill="DCE3F3" w:color="auto" w:val="clear"/>
+            <w:shd w:fill="FFFFFF" w:color="auto" w:val="clear"/>
             <w:tcMar>
               <w:top w:type="dxa" w:w="50"/>
               <w:left w:type="dxa" w:w="90"/>
@@ -10498,7 +10498,7 @@
               <w:bottom w:val="single" w:color="9AA3B5" w:sz="4"/>
               <w:right w:val="single" w:color="9AA3B5" w:sz="4"/>
             </w:tcBorders>
-            <w:shd w:fill="DCE3F3" w:color="auto" w:val="clear"/>
+            <w:shd w:fill="FFFFFF" w:color="auto" w:val="clear"/>
             <w:tcMar>
               <w:top w:type="dxa" w:w="50"/>
               <w:left w:type="dxa" w:w="90"/>
@@ -10532,7 +10532,7 @@
               <w:bottom w:val="single" w:color="9AA3B5" w:sz="4"/>
               <w:right w:val="single" w:color="9AA3B5" w:sz="4"/>
             </w:tcBorders>
-            <w:shd w:fill="DCE3F3" w:color="auto" w:val="clear"/>
+            <w:shd w:fill="FFFFFF" w:color="auto" w:val="clear"/>
             <w:tcMar>
               <w:top w:type="dxa" w:w="50"/>
               <w:left w:type="dxa" w:w="90"/>
@@ -10566,7 +10566,7 @@
               <w:bottom w:val="single" w:color="9AA3B5" w:sz="4"/>
               <w:right w:val="single" w:color="9AA3B5" w:sz="4"/>
             </w:tcBorders>
-            <w:shd w:fill="DCE3F3" w:color="auto" w:val="clear"/>
+            <w:shd w:fill="FFFFFF" w:color="auto" w:val="clear"/>
             <w:tcMar>
               <w:top w:type="dxa" w:w="50"/>
               <w:left w:type="dxa" w:w="90"/>
@@ -11814,7 +11814,7 @@
     </w:p>
     <w:p>
       <w:pPr>
-        <w:shd w:fill="F2F4F8" w:color="auto" w:val="clear"/>
+        <w:shd w:fill="FFFFFF" w:color="auto" w:val="clear"/>
         <w:spacing w:after="0" w:before="80" w:line="252"/>
         <w:ind w:left="200" w:right="200"/>
       </w:pPr>
@@ -11829,7 +11829,7 @@
     </w:p>
     <w:p>
       <w:pPr>
-        <w:shd w:fill="F2F4F8" w:color="auto" w:val="clear"/>
+        <w:shd w:fill="FFFFFF" w:color="auto" w:val="clear"/>
         <w:spacing w:after="0" w:before="0" w:line="252"/>
         <w:ind w:left="200" w:right="200"/>
       </w:pPr>
@@ -11844,7 +11844,7 @@
     </w:p>
     <w:p>
       <w:pPr>
-        <w:shd w:fill="F2F4F8" w:color="auto" w:val="clear"/>
+        <w:shd w:fill="FFFFFF" w:color="auto" w:val="clear"/>
         <w:spacing w:after="0" w:before="0" w:line="252"/>
         <w:ind w:left="200" w:right="200"/>
       </w:pPr>
@@ -11859,7 +11859,7 @@
     </w:p>
     <w:p>
       <w:pPr>
-        <w:shd w:fill="F2F4F8" w:color="auto" w:val="clear"/>
+        <w:shd w:fill="FFFFFF" w:color="auto" w:val="clear"/>
         <w:spacing w:after="0" w:before="0" w:line="252"/>
         <w:ind w:left="200" w:right="200"/>
       </w:pPr>
@@ -11874,7 +11874,7 @@
     </w:p>
     <w:p>
       <w:pPr>
-        <w:shd w:fill="F2F4F8" w:color="auto" w:val="clear"/>
+        <w:shd w:fill="FFFFFF" w:color="auto" w:val="clear"/>
         <w:spacing w:after="0" w:before="0" w:line="252"/>
         <w:ind w:left="200" w:right="200"/>
       </w:pPr>
@@ -11889,7 +11889,7 @@
     </w:p>
     <w:p>
       <w:pPr>
-        <w:shd w:fill="F2F4F8" w:color="auto" w:val="clear"/>
+        <w:shd w:fill="FFFFFF" w:color="auto" w:val="clear"/>
         <w:spacing w:after="0" w:before="0" w:line="252"/>
         <w:ind w:left="200" w:right="200"/>
       </w:pPr>
@@ -11904,7 +11904,7 @@
     </w:p>
     <w:p>
       <w:pPr>
-        <w:shd w:fill="F2F4F8" w:color="auto" w:val="clear"/>
+        <w:shd w:fill="FFFFFF" w:color="auto" w:val="clear"/>
         <w:spacing w:after="0" w:before="0" w:line="252"/>
         <w:ind w:left="200" w:right="200"/>
       </w:pPr>
@@ -11919,7 +11919,7 @@
     </w:p>
     <w:p>
       <w:pPr>
-        <w:shd w:fill="F2F4F8" w:color="auto" w:val="clear"/>
+        <w:shd w:fill="FFFFFF" w:color="auto" w:val="clear"/>
         <w:spacing w:after="0" w:before="0" w:line="252"/>
         <w:ind w:left="200" w:right="200"/>
       </w:pPr>
@@ -11934,7 +11934,7 @@
     </w:p>
     <w:p>
       <w:pPr>
-        <w:shd w:fill="F2F4F8" w:color="auto" w:val="clear"/>
+        <w:shd w:fill="FFFFFF" w:color="auto" w:val="clear"/>
         <w:spacing w:after="0" w:before="0" w:line="252"/>
         <w:ind w:left="200" w:right="200"/>
       </w:pPr>
@@ -11949,7 +11949,7 @@
     </w:p>
     <w:p>
       <w:pPr>
-        <w:shd w:fill="F2F4F8" w:color="auto" w:val="clear"/>
+        <w:shd w:fill="FFFFFF" w:color="auto" w:val="clear"/>
         <w:spacing w:after="0" w:before="0" w:line="252"/>
         <w:ind w:left="200" w:right="200"/>
       </w:pPr>
@@ -11964,7 +11964,7 @@
     </w:p>
     <w:p>
       <w:pPr>
-        <w:shd w:fill="F2F4F8" w:color="auto" w:val="clear"/>
+        <w:shd w:fill="FFFFFF" w:color="auto" w:val="clear"/>
         <w:spacing w:after="0" w:before="0" w:line="252"/>
         <w:ind w:left="200" w:right="200"/>
       </w:pPr>
@@ -11979,7 +11979,7 @@
     </w:p>
     <w:p>
       <w:pPr>
-        <w:shd w:fill="F2F4F8" w:color="auto" w:val="clear"/>
+        <w:shd w:fill="FFFFFF" w:color="auto" w:val="clear"/>
         <w:spacing w:after="0" w:before="0" w:line="252"/>
         <w:ind w:left="200" w:right="200"/>
       </w:pPr>
@@ -11994,7 +11994,7 @@
     </w:p>
     <w:p>
       <w:pPr>
-        <w:shd w:fill="F2F4F8" w:color="auto" w:val="clear"/>
+        <w:shd w:fill="FFFFFF" w:color="auto" w:val="clear"/>
         <w:spacing w:after="0" w:before="0" w:line="252"/>
         <w:ind w:left="200" w:right="200"/>
       </w:pPr>
@@ -12009,7 +12009,7 @@
     </w:p>
     <w:p>
       <w:pPr>
-        <w:shd w:fill="F2F4F8" w:color="auto" w:val="clear"/>
+        <w:shd w:fill="FFFFFF" w:color="auto" w:val="clear"/>
         <w:spacing w:after="0" w:before="0" w:line="252"/>
         <w:ind w:left="200" w:right="200"/>
       </w:pPr>
@@ -12024,7 +12024,7 @@
     </w:p>
     <w:p>
       <w:pPr>
-        <w:shd w:fill="F2F4F8" w:color="auto" w:val="clear"/>
+        <w:shd w:fill="FFFFFF" w:color="auto" w:val="clear"/>
         <w:spacing w:after="0" w:before="0" w:line="252"/>
         <w:ind w:left="200" w:right="200"/>
       </w:pPr>
@@ -12039,7 +12039,7 @@
     </w:p>
     <w:p>
       <w:pPr>
-        <w:shd w:fill="F2F4F8" w:color="auto" w:val="clear"/>
+        <w:shd w:fill="FFFFFF" w:color="auto" w:val="clear"/>
         <w:spacing w:after="0" w:before="0" w:line="252"/>
         <w:ind w:left="200" w:right="200"/>
       </w:pPr>
@@ -12054,7 +12054,7 @@
     </w:p>
     <w:p>
       <w:pPr>
-        <w:shd w:fill="F2F4F8" w:color="auto" w:val="clear"/>
+        <w:shd w:fill="FFFFFF" w:color="auto" w:val="clear"/>
         <w:spacing w:after="0" w:before="0" w:line="252"/>
         <w:ind w:left="200" w:right="200"/>
       </w:pPr>
@@ -12180,7 +12180,7 @@
               <w:bottom w:val="single" w:color="9AA3B5" w:sz="4"/>
               <w:right w:val="single" w:color="9AA3B5" w:sz="4"/>
             </w:tcBorders>
-            <w:shd w:fill="DCE3F3" w:color="auto" w:val="clear"/>
+            <w:shd w:fill="FFFFFF" w:color="auto" w:val="clear"/>
             <w:tcMar>
               <w:top w:type="dxa" w:w="50"/>
               <w:left w:type="dxa" w:w="90"/>
@@ -12214,7 +12214,7 @@
               <w:bottom w:val="single" w:color="9AA3B5" w:sz="4"/>
               <w:right w:val="single" w:color="9AA3B5" w:sz="4"/>
             </w:tcBorders>
-            <w:shd w:fill="DCE3F3" w:color="auto" w:val="clear"/>
+            <w:shd w:fill="FFFFFF" w:color="auto" w:val="clear"/>
             <w:tcMar>
               <w:top w:type="dxa" w:w="50"/>
               <w:left w:type="dxa" w:w="90"/>
@@ -12248,7 +12248,7 @@
               <w:bottom w:val="single" w:color="9AA3B5" w:sz="4"/>
               <w:right w:val="single" w:color="9AA3B5" w:sz="4"/>
             </w:tcBorders>
-            <w:shd w:fill="DCE3F3" w:color="auto" w:val="clear"/>
+            <w:shd w:fill="FFFFFF" w:color="auto" w:val="clear"/>
             <w:tcMar>
               <w:top w:type="dxa" w:w="50"/>
               <w:left w:type="dxa" w:w="90"/>
@@ -13106,7 +13106,7 @@
               <w:bottom w:val="single" w:color="9AA3B5" w:sz="4"/>
               <w:right w:val="single" w:color="9AA3B5" w:sz="4"/>
             </w:tcBorders>
-            <w:shd w:fill="DCE3F3" w:color="auto" w:val="clear"/>
+            <w:shd w:fill="FFFFFF" w:color="auto" w:val="clear"/>
             <w:tcMar>
               <w:top w:type="dxa" w:w="50"/>
               <w:left w:type="dxa" w:w="90"/>
@@ -13140,7 +13140,7 @@
               <w:bottom w:val="single" w:color="9AA3B5" w:sz="4"/>
               <w:right w:val="single" w:color="9AA3B5" w:sz="4"/>
             </w:tcBorders>
-            <w:shd w:fill="DCE3F3" w:color="auto" w:val="clear"/>
+            <w:shd w:fill="FFFFFF" w:color="auto" w:val="clear"/>
             <w:tcMar>
               <w:top w:type="dxa" w:w="50"/>
               <w:left w:type="dxa" w:w="90"/>
@@ -13174,7 +13174,7 @@
               <w:bottom w:val="single" w:color="9AA3B5" w:sz="4"/>
               <w:right w:val="single" w:color="9AA3B5" w:sz="4"/>
             </w:tcBorders>
-            <w:shd w:fill="DCE3F3" w:color="auto" w:val="clear"/>
+            <w:shd w:fill="FFFFFF" w:color="auto" w:val="clear"/>
             <w:tcMar>
               <w:top w:type="dxa" w:w="50"/>
               <w:left w:type="dxa" w:w="90"/>
@@ -13208,7 +13208,7 @@
               <w:bottom w:val="single" w:color="9AA3B5" w:sz="4"/>
               <w:right w:val="single" w:color="9AA3B5" w:sz="4"/>
             </w:tcBorders>
-            <w:shd w:fill="DCE3F3" w:color="auto" w:val="clear"/>
+            <w:shd w:fill="FFFFFF" w:color="auto" w:val="clear"/>
             <w:tcMar>
               <w:top w:type="dxa" w:w="50"/>
               <w:left w:type="dxa" w:w="90"/>
@@ -13242,7 +13242,7 @@
               <w:bottom w:val="single" w:color="9AA3B5" w:sz="4"/>
               <w:right w:val="single" w:color="9AA3B5" w:sz="4"/>
             </w:tcBorders>
-            <w:shd w:fill="DCE3F3" w:color="auto" w:val="clear"/>
+            <w:shd w:fill="FFFFFF" w:color="auto" w:val="clear"/>
             <w:tcMar>
               <w:top w:type="dxa" w:w="50"/>
               <w:left w:type="dxa" w:w="90"/>
@@ -13276,7 +13276,7 @@
               <w:bottom w:val="single" w:color="9AA3B5" w:sz="4"/>
               <w:right w:val="single" w:color="9AA3B5" w:sz="4"/>
             </w:tcBorders>
-            <w:shd w:fill="DCE3F3" w:color="auto" w:val="clear"/>
+            <w:shd w:fill="FFFFFF" w:color="auto" w:val="clear"/>
             <w:tcMar>
               <w:top w:type="dxa" w:w="50"/>
               <w:left w:type="dxa" w:w="90"/>
@@ -16171,7 +16171,7 @@
               <w:bottom w:val="single" w:color="9AA3B5" w:sz="4"/>
               <w:right w:val="single" w:color="9AA3B5" w:sz="4"/>
             </w:tcBorders>
-            <w:shd w:fill="DCE3F3" w:color="auto" w:val="clear"/>
+            <w:shd w:fill="FFFFFF" w:color="auto" w:val="clear"/>
             <w:tcMar>
               <w:top w:type="dxa" w:w="50"/>
               <w:left w:type="dxa" w:w="90"/>
@@ -16205,7 +16205,7 @@
               <w:bottom w:val="single" w:color="9AA3B5" w:sz="4"/>
               <w:right w:val="single" w:color="9AA3B5" w:sz="4"/>
             </w:tcBorders>
-            <w:shd w:fill="DCE3F3" w:color="auto" w:val="clear"/>
+            <w:shd w:fill="FFFFFF" w:color="auto" w:val="clear"/>
             <w:tcMar>
               <w:top w:type="dxa" w:w="50"/>
               <w:left w:type="dxa" w:w="90"/>
@@ -16239,7 +16239,7 @@
               <w:bottom w:val="single" w:color="9AA3B5" w:sz="4"/>
               <w:right w:val="single" w:color="9AA3B5" w:sz="4"/>
             </w:tcBorders>
-            <w:shd w:fill="DCE3F3" w:color="auto" w:val="clear"/>
+            <w:shd w:fill="FFFFFF" w:color="auto" w:val="clear"/>
             <w:tcMar>
               <w:top w:type="dxa" w:w="50"/>
               <w:left w:type="dxa" w:w="90"/>
@@ -16273,7 +16273,7 @@
               <w:bottom w:val="single" w:color="9AA3B5" w:sz="4"/>
               <w:right w:val="single" w:color="9AA3B5" w:sz="4"/>
             </w:tcBorders>
-            <w:shd w:fill="DCE3F3" w:color="auto" w:val="clear"/>
+            <w:shd w:fill="FFFFFF" w:color="auto" w:val="clear"/>
             <w:tcMar>
               <w:top w:type="dxa" w:w="50"/>
               <w:left w:type="dxa" w:w="90"/>
@@ -18203,7 +18203,7 @@
               <w:bottom w:val="single" w:color="9AA3B5" w:sz="4"/>
               <w:right w:val="single" w:color="9AA3B5" w:sz="4"/>
             </w:tcBorders>
-            <w:shd w:fill="DCE3F3" w:color="auto" w:val="clear"/>
+            <w:shd w:fill="FFFFFF" w:color="auto" w:val="clear"/>
             <w:tcMar>
               <w:top w:type="dxa" w:w="50"/>
               <w:left w:type="dxa" w:w="90"/>
@@ -18237,7 +18237,7 @@
               <w:bottom w:val="single" w:color="9AA3B5" w:sz="4"/>
               <w:right w:val="single" w:color="9AA3B5" w:sz="4"/>
             </w:tcBorders>
-            <w:shd w:fill="DCE3F3" w:color="auto" w:val="clear"/>
+            <w:shd w:fill="FFFFFF" w:color="auto" w:val="clear"/>
             <w:tcMar>
               <w:top w:type="dxa" w:w="50"/>
               <w:left w:type="dxa" w:w="90"/>
@@ -18271,7 +18271,7 @@
               <w:bottom w:val="single" w:color="9AA3B5" w:sz="4"/>
               <w:right w:val="single" w:color="9AA3B5" w:sz="4"/>
             </w:tcBorders>
-            <w:shd w:fill="DCE3F3" w:color="auto" w:val="clear"/>
+            <w:shd w:fill="FFFFFF" w:color="auto" w:val="clear"/>
             <w:tcMar>
               <w:top w:type="dxa" w:w="50"/>
               <w:left w:type="dxa" w:w="90"/>
@@ -18305,7 +18305,7 @@
               <w:bottom w:val="single" w:color="9AA3B5" w:sz="4"/>
               <w:right w:val="single" w:color="9AA3B5" w:sz="4"/>
             </w:tcBorders>
-            <w:shd w:fill="DCE3F3" w:color="auto" w:val="clear"/>
+            <w:shd w:fill="FFFFFF" w:color="auto" w:val="clear"/>
             <w:tcMar>
               <w:top w:type="dxa" w:w="50"/>
               <w:left w:type="dxa" w:w="90"/>
@@ -18339,7 +18339,7 @@
               <w:bottom w:val="single" w:color="9AA3B5" w:sz="4"/>
               <w:right w:val="single" w:color="9AA3B5" w:sz="4"/>
             </w:tcBorders>
-            <w:shd w:fill="DCE3F3" w:color="auto" w:val="clear"/>
+            <w:shd w:fill="FFFFFF" w:color="auto" w:val="clear"/>
             <w:tcMar>
               <w:top w:type="dxa" w:w="50"/>
               <w:left w:type="dxa" w:w="90"/>
@@ -21967,7 +21967,7 @@
               <w:bottom w:val="single" w:color="9AA3B5" w:sz="4"/>
               <w:right w:val="single" w:color="9AA3B5" w:sz="4"/>
             </w:tcBorders>
-            <w:shd w:fill="DCE3F3" w:color="auto" w:val="clear"/>
+            <w:shd w:fill="FFFFFF" w:color="auto" w:val="clear"/>
             <w:tcMar>
               <w:top w:type="dxa" w:w="50"/>
               <w:left w:type="dxa" w:w="90"/>
@@ -21992,7 +21992,7 @@
               <w:bottom w:val="single" w:color="9AA3B5" w:sz="4"/>
               <w:right w:val="single" w:color="9AA3B5" w:sz="4"/>
             </w:tcBorders>
-            <w:shd w:fill="DCE3F3" w:color="auto" w:val="clear"/>
+            <w:shd w:fill="FFFFFF" w:color="auto" w:val="clear"/>
             <w:tcMar>
               <w:top w:type="dxa" w:w="50"/>
               <w:left w:type="dxa" w:w="90"/>
@@ -22026,7 +22026,7 @@
               <w:bottom w:val="single" w:color="9AA3B5" w:sz="4"/>
               <w:right w:val="single" w:color="9AA3B5" w:sz="4"/>
             </w:tcBorders>
-            <w:shd w:fill="DCE3F3" w:color="auto" w:val="clear"/>
+            <w:shd w:fill="FFFFFF" w:color="auto" w:val="clear"/>
             <w:tcMar>
               <w:top w:type="dxa" w:w="50"/>
               <w:left w:type="dxa" w:w="90"/>
@@ -22436,7 +22436,7 @@
               <w:bottom w:val="single" w:color="9AA3B5" w:sz="4"/>
               <w:right w:val="single" w:color="9AA3B5" w:sz="4"/>
             </w:tcBorders>
-            <w:shd w:fill="DCE3F3" w:color="auto" w:val="clear"/>
+            <w:shd w:fill="FFFFFF" w:color="auto" w:val="clear"/>
             <w:tcMar>
               <w:top w:type="dxa" w:w="50"/>
               <w:left w:type="dxa" w:w="90"/>
@@ -22470,7 +22470,7 @@
               <w:bottom w:val="single" w:color="9AA3B5" w:sz="4"/>
               <w:right w:val="single" w:color="9AA3B5" w:sz="4"/>
             </w:tcBorders>
-            <w:shd w:fill="DCE3F3" w:color="auto" w:val="clear"/>
+            <w:shd w:fill="FFFFFF" w:color="auto" w:val="clear"/>
             <w:tcMar>
               <w:top w:type="dxa" w:w="50"/>
               <w:left w:type="dxa" w:w="90"/>
@@ -22504,7 +22504,7 @@
               <w:bottom w:val="single" w:color="9AA3B5" w:sz="4"/>
               <w:right w:val="single" w:color="9AA3B5" w:sz="4"/>
             </w:tcBorders>
-            <w:shd w:fill="DCE3F3" w:color="auto" w:val="clear"/>
+            <w:shd w:fill="FFFFFF" w:color="auto" w:val="clear"/>
             <w:tcMar>
               <w:top w:type="dxa" w:w="50"/>
               <w:left w:type="dxa" w:w="90"/>
@@ -23920,7 +23920,7 @@
               <w:bottom w:val="single" w:color="9AA3B5" w:sz="4"/>
               <w:right w:val="single" w:color="9AA3B5" w:sz="4"/>
             </w:tcBorders>
-            <w:shd w:fill="DCE3F3" w:color="auto" w:val="clear"/>
+            <w:shd w:fill="FFFFFF" w:color="auto" w:val="clear"/>
             <w:tcMar>
               <w:top w:type="dxa" w:w="50"/>
               <w:left w:type="dxa" w:w="90"/>
@@ -23954,7 +23954,7 @@
               <w:bottom w:val="single" w:color="9AA3B5" w:sz="4"/>
               <w:right w:val="single" w:color="9AA3B5" w:sz="4"/>
             </w:tcBorders>
-            <w:shd w:fill="DCE3F3" w:color="auto" w:val="clear"/>
+            <w:shd w:fill="FFFFFF" w:color="auto" w:val="clear"/>
             <w:tcMar>
               <w:top w:type="dxa" w:w="50"/>
               <w:left w:type="dxa" w:w="90"/>
@@ -24478,7 +24478,7 @@
     </w:p>
     <w:p>
       <w:pPr>
-        <w:shd w:fill="F2F4F8" w:color="auto" w:val="clear"/>
+        <w:shd w:fill="FFFFFF" w:color="auto" w:val="clear"/>
         <w:spacing w:after="0" w:before="80" w:line="252"/>
         <w:ind w:left="200" w:right="200"/>
       </w:pPr>
@@ -24493,7 +24493,7 @@
     </w:p>
     <w:p>
       <w:pPr>
-        <w:shd w:fill="F2F4F8" w:color="auto" w:val="clear"/>
+        <w:shd w:fill="FFFFFF" w:color="auto" w:val="clear"/>
         <w:spacing w:after="0" w:before="0" w:line="252"/>
         <w:ind w:left="200" w:right="200"/>
       </w:pPr>
@@ -24508,7 +24508,7 @@
     </w:p>
     <w:p>
       <w:pPr>
-        <w:shd w:fill="F2F4F8" w:color="auto" w:val="clear"/>
+        <w:shd w:fill="FFFFFF" w:color="auto" w:val="clear"/>
         <w:spacing w:after="0" w:before="0" w:line="252"/>
         <w:ind w:left="200" w:right="200"/>
       </w:pPr>
@@ -24523,7 +24523,7 @@
     </w:p>
     <w:p>
       <w:pPr>
-        <w:shd w:fill="F2F4F8" w:color="auto" w:val="clear"/>
+        <w:shd w:fill="FFFFFF" w:color="auto" w:val="clear"/>
         <w:spacing w:after="0" w:before="0" w:line="252"/>
         <w:ind w:left="200" w:right="200"/>
       </w:pPr>
@@ -24538,7 +24538,7 @@
     </w:p>
     <w:p>
       <w:pPr>
-        <w:shd w:fill="F2F4F8" w:color="auto" w:val="clear"/>
+        <w:shd w:fill="FFFFFF" w:color="auto" w:val="clear"/>
         <w:spacing w:after="0" w:before="0" w:line="252"/>
         <w:ind w:left="200" w:right="200"/>
       </w:pPr>

</xml_diff>